<commit_message>
feat: embed original project presentations, documentation files, and cloud links for all 5 product/ML projects
</commit_message>
<xml_diff>
--- a/01_мультиагентный_конвейер_стратегии_газпром/gazprom_strategy_digest.docx
+++ b/01_мультиагентный_конвейер_стратегии_газпром/gazprom_strategy_digest.docx
@@ -23,7 +23,7 @@
     </w:p>
     <w:p>
       <w:r>
-        <w:t>Временная метка: 2026-09-16 10:44:01 | Выпуск: RUN_20260916_104401 | Режим: ONLINE_LIVE_PARSING</w:t>
+        <w:t>Временная метка: 2026-09-16 10:52:15 | Выпуск: RUN_20260916_105215 | Режим: ONLINE_LIVE_PARSING</w:t>
         <w:br/>
       </w:r>
     </w:p>
@@ -42,7 +42,7 @@
         <w:rPr>
           <w:b/>
         </w:rPr>
-        <w:t>• Идентифицированная угроза: WSJ: нефтяные компании США объявили о начале глобального топливного кризиса</w:t>
+        <w:t>• Идентифицированная угроза: Алиханов предложил создать «национального нефтесервисного чемпиона» // Глава Минпромторга Алиханов предложил объединить усилия нефтесервисных компаний</w:t>
         <w:br/>
       </w:r>
       <w:r>
@@ -58,7 +58,7 @@
         <w:br/>
       </w:r>
       <w:r>
-        <w:t>• Суть фактора риска: Глобальный топливный кризис, о котором предупреждали крупнейшие нефтяные компании мира, уже наступил. Руководители американских Chevron и ExxonMobil заявляют, что длительная блокировка Ормузского пролива и атака на нефтепровод «Восток -- Запад» в Саудовской Аравии привели к серьезным перебоям в поставках, пишет The Wall Street Journal (WSJ).</w:t>
+        <w:t>• Суть фактора риска: Министерство промышленности и торговли обсуждает объединение усилий предприятий и регионов для развития российских нефтесервисных предприятий. Глава ведомства Антон Алиханов призывает к созданию «национального чемпиона» в этой отрасли для продвижения технологий и оборудования на экспорт.</w:t>
         <w:br/>
       </w:r>
     </w:p>

</xml_diff>